<commit_message>
qas: added placeholders to template + full JSON schema
</commit_message>
<xml_diff>
--- a/templates/plantilla_reporte.docx
+++ b/templates/plantilla_reporte.docx
@@ -1467,7 +1467,7 @@
         <w:pStyle w:val="Estilo3"/>
       </w:pPr>
       <w:r>
-        <w:t>Servicio de monitoreo proactivo implementado por TXDXSECURE para garantizar seguridad, disponibilidad y rendimiento, mediante capacidades de correlación de eventos, gestión de vulnerabilidades, monitoreo de infraestructura y validación operativa sobre activos críticos del cliente Mi Fibra.</w:t>
+        <w:t>{{ servicio_monitoreo }}</w:t>
       </w:r>
     </w:p>
     <w:p>
@@ -1486,24 +1486,16 @@
         <w:pStyle w:val="Estilo3"/>
       </w:pPr>
       <w:r>
-        <w:t xml:space="preserve">Del </w:t>
+        <w:t>{{ periodo }}</w:t>
       </w:r>
       <w:proofErr w:type="gramStart"/>
-      <w:r>
-        <w:t>Sábado</w:t>
-      </w:r>
+      <w:r/>
       <w:proofErr w:type="gramEnd"/>
-      <w:r>
-        <w:t xml:space="preserve"> 20 al viernes 26 de </w:t>
-      </w:r>
+      <w:r/>
       <w:proofErr w:type="gramStart"/>
-      <w:r>
-        <w:t>Junio</w:t>
-      </w:r>
+      <w:r/>
       <w:proofErr w:type="gramEnd"/>
-      <w:r>
-        <w:t xml:space="preserve"> del 2026</w:t>
-      </w:r>
+      <w:r/>
     </w:p>
     <w:p>
       <w:pPr>
@@ -1521,7 +1513,7 @@
         <w:pStyle w:val="Estilo6"/>
       </w:pPr>
       <w:r>
-        <w:t>MonEvents: correlación y monitoreo de eventos de seguridad.</w:t>
+        <w:t>{{ herramienta_1 }}</w:t>
       </w:r>
     </w:p>
     <w:p>
@@ -1529,7 +1521,7 @@
         <w:pStyle w:val="Estilo6"/>
       </w:pPr>
       <w:r>
-        <w:t>MonVulE: escaneo de vulnerabilidades en rangos de gestión y red.</w:t>
+        <w:t>{{ herramienta_2 }}</w:t>
       </w:r>
     </w:p>
     <w:p>
@@ -1537,7 +1529,7 @@
         <w:pStyle w:val="Estilo6"/>
       </w:pPr>
       <w:r>
-        <w:t>MonVulC: análisis de vulnerabilidades en servidores/activos críticos.</w:t>
+        <w:t>{{ herramienta_3 }}</w:t>
       </w:r>
     </w:p>
     <w:p>
@@ -1545,7 +1537,7 @@
         <w:pStyle w:val="Estilo6"/>
       </w:pPr>
       <w:r>
-        <w:t>MonVulS: priorización de riesgo y gestión de vulnerabilidades en servidores.</w:t>
+        <w:t>{{ herramienta_4 }}</w:t>
       </w:r>
     </w:p>
     <w:p>
@@ -1553,7 +1545,7 @@
         <w:pStyle w:val="Estilo6"/>
       </w:pPr>
       <w:r>
-        <w:t>MonApps: monitoreo de disponibilidad (ICMP/servicios) de OLTs y equipos.</w:t>
+        <w:t>{{ herramienta_5 }}</w:t>
       </w:r>
     </w:p>
     <w:p>
@@ -1561,7 +1553,7 @@
         <w:pStyle w:val="Estilo6"/>
       </w:pPr>
       <w:r>
-        <w:t>MonNet, MonInfra: monitoreo de rendimiento e infraestructura (firewalls Palo Alto).</w:t>
+        <w:t>{{ herramienta_6 }}</w:t>
       </w:r>
     </w:p>
     <w:p>
@@ -1569,7 +1561,7 @@
         <w:pStyle w:val="Estilo3"/>
       </w:pPr>
       <w:r>
-        <w:t>Acceso remoto y colaboración: Webex (web conferencia) y GlobalProtect (VPN).</w:t>
+        <w:t>{{ herramienta_7 }}</w:t>
       </w:r>
     </w:p>
     <w:p>
@@ -1588,7 +1580,7 @@
         <w:pStyle w:val="Estilo3"/>
       </w:pPr>
       <w:r>
-        <w:t>TxDxSecure implementó este servicio integral de monitoreo y gestión de vulnerabilidades basado en las herramientas indicadas, brindando visibilidad del entorno on-premise (sedes) y del ambiente virtualizado en Canadá.</w:t>
+        <w:t>{{ datos_base }}</w:t>
       </w:r>
     </w:p>
     <w:p>
@@ -1596,7 +1588,7 @@
         <w:pStyle w:val="Estilo3"/>
       </w:pPr>
       <w:r>
-        <w:t>Entorno: On-premise (sedes) + virtualizado en Canadá. No se incluyen cargas cloud.</w:t>
+        <w:t>{{ entorno }}</w:t>
       </w:r>
     </w:p>
     <w:p>
@@ -1615,7 +1607,7 @@
         <w:pStyle w:val="Estilo3"/>
       </w:pPr>
       <w:r>
-        <w:t>Durante el periodo evaluado se mantuvo la visibilidad operativa sobre activos expuestos públicamente, portales web externos, firewalls perimetrales, teletrabajo, servidores críticos, infraestructura monitoreada y dominios operativos disponibles para Mi Fibra. La postura general se mantiene bajo seguimiento técnico, con exposición concentrada en IPs públicas, servicios legacy, debilidades criptográficas SSH/TLS, certificados no confiables o con CN no coincidente, servicios de correo expuestos y hallazgos relevantes en infraestructura de servidores.</w:t>
+        <w:t>{{ resumen_parrafo_1 }}</w:t>
       </w:r>
     </w:p>
     <w:p>
@@ -1623,7 +1615,7 @@
         <w:pStyle w:val="Estilo3"/>
       </w:pPr>
       <w:r>
-        <w:t>En el dominio de IPs públicas, el conteo comparativo se construyó exclusivamente con la tabla de hallazgos individuales del dominio 3.2. La semana actual presenta 110 hallazgos considerados frente a 109 de la semana pasada. No se registran hallazgos críticos ni informativos; los hallazgos altos permanecen en 3, asociados al activo 161.132.57.206 por Exim/libspf2 sobre servicios SMTP públicos. Se evidencia un incremento leve de un hallazgo medio y estabilidad en hallazgos bajos.</w:t>
+        <w:t>{{ resumen_parrafo_2 }}</w:t>
       </w:r>
     </w:p>
     <w:p>
@@ -1631,8 +1623,7 @@
         <w:pStyle w:val="Estilo3"/>
       </w:pPr>
       <w:r>
-        <w:lastRenderedPageBreak/>
-        <w:t>En infraestructura de cómputo - servidores, la evidencia actual muestra 15 activos procesados con criticidad Very High y High. Persisten hallazgos relevantes asociados a Apache HTTPD, OpenSSH, Dell iDRAC, VNC, IPMI, FTP, certificados TLS/SSL, servicios de base de datos y configuraciones criptográficas débiles. En IPS_GENESYS se evidencia un avance importante: de 100 vulnerabilidades iniciales se redujo a 28 vulnerabilidades actuales, manteniendo seguimiento para cierre y reescaneo.</w:t>
+        <w:t>{{ resumen_parrafo_3 }}</w:t>
       </w:r>
     </w:p>
     <w:p>
@@ -1640,7 +1631,7 @@
         <w:pStyle w:val="Estilo3"/>
       </w:pPr>
       <w:r>
-        <w:t>Durante la semana se fortaleció la operación del XOC mediante consultas vía Telegram para GlobalProtect, incluyendo usuarios conectados, trazabilidad por IP privada asignada y análisis histórico de a qué usuario pertenecía una IP en un momento específico. Asimismo, se ejecutaron acciones de mitigación en el servidor BD Tráfico/Speedtest (172.16.10.243), manteniendo continuidad operativa posterior a los cambios.</w:t>
+        <w:t>{{ resumen_parrafo_4 }}</w:t>
       </w:r>
     </w:p>
     <w:p>
@@ -1659,7 +1650,7 @@
         <w:pStyle w:val="Estilo3"/>
       </w:pPr>
       <w:r>
-        <w:t>El análisis comparativo se construyó exclusivamente con información del dominio de IPs públicas. Frente al periodo anterior, el total de exposición pasa de 109 a 110 hallazgos considerados. Los hallazgos críticos e informativos permanecen en 0; los hallazgos altos se mantienen en 3; los hallazgos medios pasan de 80 a 81 y los bajos se mantienen en 26. La tendencia semanal se considera estable con incremento leve de exposición media, sin deterioro en criticidad alta o crítica. Persisten riesgos relevantes asociados a Exim/libspf2, Telnet, credenciales en texto claro, renegociación SSL/TLS y algoritmos SSH débiles.</w:t>
+        <w:t>{{ analisis_comparativo }}</w:t>
       </w:r>
     </w:p>
     <w:p>
@@ -1670,7 +1661,7 @@
         <w:rPr>
           <w:i/>
         </w:rPr>
-        <w:t>Observación técnica: no se detectaron duplicados exactos en la tabla de hallazgos individuales procesada para el dominio de IPs públicas. Duplicados exactos excluidos: 0.</w:t>
+        <w:t>{{ observacion_tecnica }}</w:t>
       </w:r>
     </w:p>
     <w:p>
@@ -1846,7 +1837,7 @@
               <w:rPr>
                 <w:sz w:val="16"/>
               </w:rPr>
-              <w:t>0</w:t>
+              <w:t>{{ comp_critico_pasada }}</w:t>
             </w:r>
           </w:p>
         </w:tc>
@@ -1860,7 +1851,7 @@
               <w:rPr>
                 <w:sz w:val="16"/>
               </w:rPr>
-              <w:t>0</w:t>
+              <w:t>{{ comp_critico_actual }}</w:t>
             </w:r>
           </w:p>
         </w:tc>
@@ -1874,7 +1865,7 @@
               <w:rPr>
                 <w:sz w:val="16"/>
               </w:rPr>
-              <w:t>0</w:t>
+              <w:t>{{ comp_critico_variacion }}</w:t>
             </w:r>
           </w:p>
         </w:tc>
@@ -1907,7 +1898,7 @@
               <w:rPr>
                 <w:sz w:val="16"/>
               </w:rPr>
-              <w:t>3</w:t>
+              <w:t>{{ comp_alto_pasada }}</w:t>
             </w:r>
           </w:p>
         </w:tc>
@@ -1921,7 +1912,7 @@
               <w:rPr>
                 <w:sz w:val="16"/>
               </w:rPr>
-              <w:t>3</w:t>
+              <w:t>{{ comp_alto_actual }}</w:t>
             </w:r>
           </w:p>
         </w:tc>
@@ -1935,7 +1926,7 @@
               <w:rPr>
                 <w:sz w:val="16"/>
               </w:rPr>
-              <w:t>0</w:t>
+              <w:t>{{ comp_alto_variacion }}</w:t>
             </w:r>
           </w:p>
         </w:tc>
@@ -1968,7 +1959,7 @@
               <w:rPr>
                 <w:sz w:val="16"/>
               </w:rPr>
-              <w:t>80</w:t>
+              <w:t>{{ comp_medio_pasada }}</w:t>
             </w:r>
           </w:p>
         </w:tc>
@@ -1982,7 +1973,7 @@
               <w:rPr>
                 <w:sz w:val="16"/>
               </w:rPr>
-              <w:t>81</w:t>
+              <w:t>{{ comp_medio_actual }}</w:t>
             </w:r>
           </w:p>
         </w:tc>
@@ -1996,7 +1987,7 @@
               <w:rPr>
                 <w:sz w:val="16"/>
               </w:rPr>
-              <w:t>1</w:t>
+              <w:t>{{ comp_medio_variacion }}</w:t>
             </w:r>
           </w:p>
         </w:tc>
@@ -2029,7 +2020,7 @@
               <w:rPr>
                 <w:sz w:val="16"/>
               </w:rPr>
-              <w:t>26</w:t>
+              <w:t>{{ comp_bajo_pasada }}</w:t>
             </w:r>
           </w:p>
         </w:tc>
@@ -2043,7 +2034,7 @@
               <w:rPr>
                 <w:sz w:val="16"/>
               </w:rPr>
-              <w:t>26</w:t>
+              <w:t>{{ comp_bajo_actual }}</w:t>
             </w:r>
           </w:p>
         </w:tc>
@@ -2057,7 +2048,7 @@
               <w:rPr>
                 <w:sz w:val="16"/>
               </w:rPr>
-              <w:t>0</w:t>
+              <w:t>{{ comp_bajo_variacion }}</w:t>
             </w:r>
           </w:p>
         </w:tc>
@@ -2090,7 +2081,7 @@
               <w:rPr>
                 <w:sz w:val="16"/>
               </w:rPr>
-              <w:t>0</w:t>
+              <w:t>{{ comp_info_pasada }}</w:t>
             </w:r>
           </w:p>
         </w:tc>
@@ -2104,7 +2095,7 @@
               <w:rPr>
                 <w:sz w:val="16"/>
               </w:rPr>
-              <w:t>0</w:t>
+              <w:t>{{ comp_info_actual }}</w:t>
             </w:r>
           </w:p>
         </w:tc>
@@ -2118,7 +2109,7 @@
               <w:rPr>
                 <w:sz w:val="16"/>
               </w:rPr>
-              <w:t>0</w:t>
+              <w:t>{{ comp_info_variacion }}</w:t>
             </w:r>
           </w:p>
         </w:tc>
@@ -2152,7 +2143,7 @@
         <w:pStyle w:val="Estilo6"/>
       </w:pPr>
       <w:r>
-        <w:t>Se mantuvo la cobertura de monitoreo sobre dominios críticos del servicio, incluyendo IPs públicas, web externo, infraestructura de cómputo, firewalls perimetrales, teletrabajo y activos disponibles.</w:t>
+        <w:t>{{ resultado_1 }}</w:t>
       </w:r>
     </w:p>
     <w:p>
@@ -2160,7 +2151,7 @@
         <w:pStyle w:val="Estilo6"/>
       </w:pPr>
       <w:r>
-        <w:t>Se consolidó el análisis comparativo del dominio de IPs públicas, evidenciando una variación leve del total de hallazgos: 109 en la semana pasada y 110 en la semana actual.</w:t>
+        <w:t>{{ resultado_2 }}</w:t>
       </w:r>
     </w:p>
     <w:p>
@@ -2168,7 +2159,7 @@
         <w:pStyle w:val="Estilo6"/>
       </w:pPr>
       <w:r>
-        <w:t>Se mantuvieron 3 hallazgos altos en IPs públicas asociados a Exim/libspf2 sobre 161.132.57.206, sin incremento de severidad crítica.</w:t>
+        <w:t>{{ resultado_3 }}</w:t>
       </w:r>
     </w:p>
     <w:p>
@@ -2176,7 +2167,7 @@
         <w:pStyle w:val="Estilo6"/>
       </w:pPr>
       <w:r>
-        <w:t>Se evidenció una reducción considerable en los servidores de IPS_GENESYS, pasando de 100 vulnerabilidades iniciales a 28 vulnerabilidades actuales.</w:t>
+        <w:t>{{ resultado_4 }}</w:t>
       </w:r>
     </w:p>
     <w:p>
@@ -2184,7 +2175,7 @@
         <w:pStyle w:val="Estilo6"/>
       </w:pPr>
       <w:r>
-        <w:t>Se implementaron consultas vía Telegram para revisión de usuarios conectados por GlobalProtect y análisis histórico de asignación de IP VPN a usuario en un momento específico.</w:t>
+        <w:t>{{ resultado_5 }}</w:t>
       </w:r>
     </w:p>
     <w:p>
@@ -2192,7 +2183,7 @@
         <w:pStyle w:val="Estilo6"/>
       </w:pPr>
       <w:r>
-        <w:t>Se realizaron acciones de mitigación en el servidor BD Tráfico/Speedtest (172.16.10.243), incluyendo hardening de Apache, PHP, TLS/SCHANNEL y control de acceso a servicios de base de datos.</w:t>
+        <w:t>{{ resultado_6 }}</w:t>
       </w:r>
     </w:p>
     <w:p>
@@ -2200,7 +2191,7 @@
         <w:pStyle w:val="Estilo6"/>
       </w:pPr>
       <w:r>
-        <w:t>Se validó continuidad operativa posterior a los cambios sobre Apache, PHP, MySQL y la aplicación Friendly, obteniendo respuesta HTTP 200.</w:t>
+        <w:t>{{ resultado_7 }}</w:t>
       </w:r>
     </w:p>
     <w:p>
@@ -2219,7 +2210,7 @@
         <w:pStyle w:val="Estilo6"/>
       </w:pPr>
       <w:r>
-        <w:t>Coordinar la ventana de mantenimiento para mitigación técnica del dominio de firewalls Palo Alto y endurecimiento de GlobalProtect/VPN.</w:t>
+        <w:t>{{ accion_1 }}</w:t>
       </w:r>
     </w:p>
     <w:p>
@@ -2227,7 +2218,7 @@
         <w:pStyle w:val="Estilo6"/>
       </w:pPr>
       <w:r>
-        <w:t>Validar el estado de mitigación del frente web por parte del equipo de sistemas y mantener seguimiento hasta contar con evidencia de corrección.</w:t>
+        <w:t>{{ accion_2 }}</w:t>
       </w:r>
     </w:p>
     <w:p>
@@ -2235,7 +2226,7 @@
         <w:pStyle w:val="Estilo6"/>
       </w:pPr>
       <w:r>
-        <w:t>Coordinar la instalación o ampliación de agentes de monitoreo en servidores priorizados para obtener métricas de disponibilidad, recursos, servicios y alertamiento preventivo.</w:t>
+        <w:t>{{ accion_3 }}</w:t>
       </w:r>
     </w:p>
     <w:p>
@@ -2243,7 +2234,7 @@
         <w:pStyle w:val="Estilo6"/>
       </w:pPr>
       <w:r>
-        <w:t>Coordinar, si aplica, la definición de rutas críticas a monitorear en servidores Windows, incluyendo alcance, rutas, criticidad, responsables y ventana de implementación.</w:t>
+        <w:t>{{ accion_4 }}</w:t>
       </w:r>
     </w:p>
     <w:p>
@@ -2251,7 +2242,7 @@
         <w:pStyle w:val="Estilo6"/>
       </w:pPr>
       <w:r>
-        <w:t>Coordinar la definición de rangos autorizados o lista de exclusión para desktops/equipos de usuario, a fin de reducir impacto operativo durante pruebas de vulnerabilidades.</w:t>
+        <w:t>{{ accion_5 }}</w:t>
       </w:r>
     </w:p>
     <w:p>
@@ -2259,7 +2250,7 @@
         <w:pStyle w:val="Estilo6"/>
       </w:pPr>
       <w:r>
-        <w:t>Mantener seguimiento sobre IPS_GENESYS hasta validar cierre de vulnerabilidades residuales y estabilidad posterior a los cambios.</w:t>
+        <w:t>{{ accion_6 }}</w:t>
       </w:r>
     </w:p>
     <w:p>
@@ -2278,7 +2269,7 @@
         <w:pStyle w:val="Estilo6"/>
       </w:pPr>
       <w:r>
-        <w:t>Confirmación de fecha y ventana de mantenimiento para la mitigación de vulnerabilidades de firewalls Palo Alto.</w:t>
+        <w:t>{{ requerimiento_1 }}</w:t>
       </w:r>
     </w:p>
     <w:p>
@@ -2286,7 +2277,7 @@
         <w:pStyle w:val="Estilo6"/>
       </w:pPr>
       <w:r>
-        <w:t>Confirmación del estado de mitigación del frente web por parte del equipo de sistemas.</w:t>
+        <w:t>{{ requerimiento_2 }}</w:t>
       </w:r>
     </w:p>
     <w:p>
@@ -2294,8 +2285,7 @@
         <w:pStyle w:val="Estilo6"/>
       </w:pPr>
       <w:r>
-        <w:lastRenderedPageBreak/>
-        <w:t>Aprobación para instalar o ampliar agentes de monitoreo en servidores priorizados, considerando que complementarán la visibilidad de Wazuh Agent con métricas de infraestructura.</w:t>
+        <w:t>{{ requerimiento_3 }}</w:t>
       </w:r>
     </w:p>
     <w:p>
@@ -2303,7 +2293,7 @@
         <w:pStyle w:val="Estilo6"/>
       </w:pPr>
       <w:r>
-        <w:t>Validación del inventario de switches, APs, desktops y activos OT/IoT para ampliar la cobertura de monitoreo en dominios aún no integrados.</w:t>
+        <w:t>{{ requerimiento_4 }}</w:t>
       </w:r>
     </w:p>
     <w:p>
@@ -2311,7 +2301,7 @@
         <w:pStyle w:val="Estilo6"/>
       </w:pPr>
       <w:r>
-        <w:t>Definición formal de segmentos, rangos o activos a excluir en el dominio de desktops para evitar afectación a labores de usuarios finales durante escaneos.</w:t>
+        <w:t>{{ requerimiento_5 }}</w:t>
       </w:r>
     </w:p>
     <w:p>
@@ -2319,7 +2309,7 @@
         <w:pStyle w:val="Estilo6"/>
       </w:pPr>
       <w:r>
-        <w:t>Provisión de recursos de plataforma solicitados previamente, incluyendo ampliación de disco y RAM, para fortalecer la capacidad de los servidores de monitoreo y análisis de vulnerabilidades.</w:t>
+        <w:t>{{ requerimiento_6 }}</w:t>
       </w:r>
     </w:p>
     <w:p>
@@ -2327,7 +2317,7 @@
         <w:pStyle w:val="Estilo6"/>
       </w:pPr>
       <w:r>
-        <w:t>Wazuh se encuentra aproximadamente al 90 % de su capacidad; se realizarán optimizaciones para no interrumpir la recopilación de logs futuros provenientes del firewall PA Transmisiones y otras fuentes de logs.</w:t>
+        <w:t>{{ requerimiento_7 }}</w:t>
       </w:r>
     </w:p>
     <w:p>
@@ -2335,7 +2325,7 @@
         <w:pStyle w:val="Estilo6"/>
       </w:pPr>
       <w:r>
-        <w:t>Confirmación de rutas críticas de archivos/carpetas en servidores Windows si se desea implementar monitoreo de cambios o integridad sobre rutas sensibles.</w:t>
+        <w:t>{{ requerimiento_8 }}</w:t>
       </w:r>
     </w:p>
     <w:p>
@@ -2365,7 +2355,7 @@
         <w:pStyle w:val="Estilo3"/>
       </w:pPr>
       <w:r>
-        <w:t>Durante el periodo evaluado se mantiene seguimiento sobre hallazgos web previamente identificados en portales públicos expuestos a Internet. No se recibió confirmación formal de mitigación por parte del equipo de sistemas, por lo que los hallazgos se conservan como pendientes de validación/corrección.</w:t>
+        <w:t>{{ hallazgo_web_1 }}</w:t>
       </w:r>
     </w:p>
     <w:p>
@@ -2373,7 +2363,7 @@
         <w:pStyle w:val="Estilo3"/>
       </w:pPr>
       <w:r>
-        <w:t>Activo / Portal / URL: https://apis.mifibra.com.pe, https://cuentasxpagar.mifibra.com.pe, https://mifibra.com.pe | Severidad: Media | Vulnerabilidad: CSP Header Not Set | Evidencia: Ausencia de Content-Security-Policy. | Estado: Pendiente de confirmación de mitigación. | Impacto ejecutivo resumido: Incrementa el riesgo de inyección de contenido, XSS y abuso de recursos del navegador.</w:t>
+        <w:t>{{ hallazgo_web_2 }}</w:t>
       </w:r>
     </w:p>
     <w:p>
@@ -2381,7 +2371,7 @@
         <w:pStyle w:val="Estilo3"/>
       </w:pPr>
       <w:r>
-        <w:t>Activo / Portal / URL: https://mifibra.pe | Severidad: Media | Vulnerabilidad: CSP débil o demasiado permisiva | Evidencia: Política CSP con configuraciones amplias como unsafe-inline, unsafe-eval o directivas abiertas/faltantes. | Estado: Pendiente de endurecimiento / confirmación. | Impacto ejecutivo resumido: Reduce la efectividad de los controles preventivos del navegador ante scripts no autorizados.</w:t>
+        <w:t>{{ hallazgo_web_3 }}</w:t>
       </w:r>
     </w:p>
     <w:p>
@@ -2389,43 +2379,32 @@
         <w:pStyle w:val="Estilo3"/>
       </w:pPr>
       <w:r>
-        <w:t>Activo / Portal / URL: https://apis.mifibra.com.pe, https://cuentasxpagar.mifibra.com.pe | Severidad: Media | Vulnerabilidad: Falta de protección anti-clickjacking | Evidencia: Ausencia de controles como X-</w:t>
+        <w:t>{{ hallazgo_web_4 }}</w:t>
       </w:r>
       <w:proofErr w:type="gramStart"/>
-      <w:r>
-        <w:t>Frame</w:t>
-      </w:r>
+      <w:r/>
       <w:proofErr w:type="gramEnd"/>
-      <w:r>
-        <w:t xml:space="preserve">-Options o </w:t>
-      </w:r>
+      <w:r/>
       <w:proofErr w:type="gramStart"/>
-      <w:r>
-        <w:t>frame</w:t>
-      </w:r>
+      <w:r/>
       <w:proofErr w:type="gramEnd"/>
-      <w:r>
-        <w:t>-ancestors. | Estado: Pendiente de mitigación / confirmación. | Impacto ejecutivo resumido: Permite que el portal pueda ser embebido por terceros, incrementando riesgo de engaño al usuario.</w:t>
-      </w:r>
+      <w:r/>
     </w:p>
     <w:p>
       <w:pPr>
         <w:pStyle w:val="Estilo3"/>
       </w:pPr>
       <w:r>
-        <w:t xml:space="preserve">Activo / Portal / URL: http://apis.mifibra.com.pe, http://cuentasxpagar.mifibra.com.pe, http://mifibra.com.pe | Severidad: Baja | Vulnerabilidad: Contenido HTTPS accesible también por HTTP | Evidencia: Persistencia de acceso por HTTP o comportamiento de redirección pendiente de validación. | Estado: Pendiente de validación/corrección. | Impacto ejecutivo resumido: Incrementa el riesgo de intercepción, downgrade o </w:t>
-      </w:r>
-      <w:r>
-        <w:lastRenderedPageBreak/>
-        <w:t>exposición accidental de tráfico no protegido.</w:t>
-      </w:r>
+        <w:t>{{ hallazgo_web_5 }}</w:t>
+      </w:r>
+      <w:r/>
     </w:p>
     <w:p>
       <w:pPr>
         <w:pStyle w:val="Estilo3"/>
       </w:pPr>
       <w:r>
-        <w:t>Activo / Portal / URL: https://apis.mifibra.com.pe:2083, https://mifibra.com.pe:2083 | Severidad: Media | Vulnerabilidad: Exposición de mensajes de error / error disclosure en superficie administrativa | Evidencia: Presencia de mensajes internal error o mensajes técnicos expuestos. | Estado: Pendiente de mitigación / confirmación. | Impacto ejecutivo resumido: Puede filtrar información técnica útil para reconocimiento y ataques dirigidos.</w:t>
+        <w:t>{{ hallazgo_web_6 }}</w:t>
       </w:r>
     </w:p>
     <w:p>
@@ -2444,7 +2423,7 @@
         <w:pStyle w:val="Estilo3"/>
       </w:pPr>
       <w:r>
-        <w:t>La exposición pública continúa concentrándose en servicios inseguros o heredados, debilidades criptográficas, certificados no confiables o con CN no coincidente, servicios Telnet expuestos, transmisión de credenciales en texto claro y vulnerabilidades asociadas a servicios de correo, SSH, HTTP/HTTPS y VPN.</w:t>
+        <w:t>{{ hallazgo_ips_1 }}</w:t>
       </w:r>
     </w:p>
     <w:p>
@@ -2452,7 +2431,7 @@
         <w:pStyle w:val="Estilo3"/>
       </w:pPr>
       <w:r>
-        <w:t>MonVulE</w:t>
+        <w:t>{{ hallazgo_ips_2 }}</w:t>
       </w:r>
     </w:p>
     <w:p>
@@ -2460,7 +2439,7 @@
         <w:pStyle w:val="Estilo3"/>
       </w:pPr>
       <w:r>
-        <w:t>Resumen de hallazgos individuales del escaneo: total considerado 110 hallazgos individuales en IPs públicas.</w:t>
+        <w:t>{{ hallazgo_ips_3 }}</w:t>
       </w:r>
     </w:p>
     <w:p>
@@ -2468,7 +2447,7 @@
         <w:pStyle w:val="Estilo3"/>
       </w:pPr>
       <w:r>
-        <w:t>Severidad: Alta 3, Media 81, Baja 26, Crítica 0, Informativa 0.</w:t>
+        <w:t>{{ hallazgo_ips_4 }}</w:t>
       </w:r>
     </w:p>
     <w:p>
@@ -2476,7 +2455,7 @@
         <w:pStyle w:val="Estilo3"/>
       </w:pPr>
       <w:r>
-        <w:t>Activos observados: 144.217.189.217, 161.132.57.206, 170.254.233.113, 34.56.74.153, 34.61.232.19, 38.224.75.254, 38.255.105.247, 38.255.111.238, 38.56.215.237, 38.56.216.239, 38.56.220.246.</w:t>
+        <w:t>{{ hallazgo_ips_5 }}</w:t>
       </w:r>
     </w:p>
     <w:p>
@@ -2484,7 +2463,7 @@
         <w:pStyle w:val="Estilo3"/>
       </w:pPr>
       <w:r>
-        <w:t>Estado: Pendiente de remediación y validación posterior mediante reescaneo.</w:t>
+        <w:t>{{ hallazgo_ips_6 }}</w:t>
       </w:r>
     </w:p>
     <w:p>
@@ -2492,7 +2471,7 @@
         <w:pStyle w:val="Estilo3"/>
       </w:pPr>
       <w:r>
-        <w:t>Observación técnica: No se identificaron duplicados exactos en la tabla procesada para el conteo. Duplicados exactos excluidos: 0.</w:t>
+        <w:t>{{ hallazgo_ips_7 }}</w:t>
       </w:r>
     </w:p>
     <w:p>
@@ -2500,404 +2479,343 @@
         <w:pStyle w:val="Estilo6"/>
       </w:pPr>
       <w:r>
-        <w:t xml:space="preserve">Activo: 161.132.57.206 / ylp-atuq.yachay.pe / ylp-atuq.test.com.pe. Severidad: Alta / Media / Baja. </w:t>
+        <w:t>{{ hallazgo_ips_8 }}</w:t>
       </w:r>
       <w:proofErr w:type="spellStart"/>
       <w:r>
         <w:rPr>
           <w:lang w:val="en-US"/>
         </w:rPr>
-        <w:t>Vulnerabilidades</w:t>
       </w:r>
       <w:proofErr w:type="spellEnd"/>
       <w:r>
         <w:rPr>
           <w:lang w:val="en-US"/>
         </w:rPr>
-        <w:t xml:space="preserve"> </w:t>
       </w:r>
       <w:proofErr w:type="spellStart"/>
       <w:r>
         <w:rPr>
           <w:lang w:val="en-US"/>
         </w:rPr>
-        <w:t>principales</w:t>
       </w:r>
       <w:proofErr w:type="spellEnd"/>
       <w:r>
         <w:rPr>
           <w:lang w:val="en-US"/>
         </w:rPr>
-        <w:t xml:space="preserve">: Exim &lt;= 4.96.2 libspf2 RCE Vulnerability (Sep 2023), SSL/TLS Renegotiation DoS, FTP/IMAP/POP3/SMTP Unencrypted Cleartext Login y TCP/ICMP Timestamp Information Disclosure. </w:t>
       </w:r>
       <w:proofErr w:type="spellStart"/>
       <w:r>
         <w:rPr>
           <w:lang w:val="en-US"/>
         </w:rPr>
-        <w:t>Evidencia</w:t>
       </w:r>
       <w:proofErr w:type="spellEnd"/>
       <w:r>
         <w:rPr>
           <w:lang w:val="en-US"/>
         </w:rPr>
-        <w:t xml:space="preserve"> </w:t>
       </w:r>
       <w:proofErr w:type="spellStart"/>
       <w:r>
         <w:rPr>
           <w:lang w:val="en-US"/>
         </w:rPr>
-        <w:t>relevante</w:t>
       </w:r>
       <w:proofErr w:type="spellEnd"/>
       <w:r>
         <w:rPr>
           <w:lang w:val="en-US"/>
         </w:rPr>
-        <w:t xml:space="preserve">: CVSS 8.8 High </w:t>
       </w:r>
       <w:proofErr w:type="gramStart"/>
       <w:r>
         <w:rPr>
           <w:lang w:val="en-US"/>
         </w:rPr>
-        <w:t>para Exim</w:t>
       </w:r>
       <w:proofErr w:type="gramEnd"/>
       <w:r>
         <w:rPr>
           <w:lang w:val="en-US"/>
         </w:rPr>
-        <w:t xml:space="preserve">/libspf2; </w:t>
       </w:r>
       <w:proofErr w:type="spellStart"/>
       <w:r>
         <w:rPr>
           <w:lang w:val="en-US"/>
         </w:rPr>
-        <w:t>QoD</w:t>
       </w:r>
       <w:proofErr w:type="spellEnd"/>
       <w:r>
         <w:rPr>
           <w:lang w:val="en-US"/>
         </w:rPr>
-        <w:t xml:space="preserve"> 70 % - 80 %. </w:t>
       </w:r>
       <w:proofErr w:type="spellStart"/>
       <w:r>
         <w:rPr>
           <w:lang w:val="en-US"/>
         </w:rPr>
-        <w:t>Puertos</w:t>
       </w:r>
       <w:proofErr w:type="spellEnd"/>
       <w:r>
         <w:rPr>
           <w:lang w:val="en-US"/>
         </w:rPr>
-        <w:t>: 25/</w:t>
       </w:r>
       <w:proofErr w:type="spellStart"/>
       <w:r>
         <w:rPr>
           <w:lang w:val="en-US"/>
         </w:rPr>
-        <w:t>tcp</w:t>
       </w:r>
       <w:proofErr w:type="spellEnd"/>
       <w:r>
         <w:rPr>
           <w:lang w:val="en-US"/>
         </w:rPr>
-        <w:t>, 465/</w:t>
       </w:r>
       <w:proofErr w:type="spellStart"/>
       <w:r>
         <w:rPr>
           <w:lang w:val="en-US"/>
         </w:rPr>
-        <w:t>tcp</w:t>
       </w:r>
       <w:proofErr w:type="spellEnd"/>
       <w:r>
         <w:rPr>
           <w:lang w:val="en-US"/>
         </w:rPr>
-        <w:t>, 587/</w:t>
       </w:r>
       <w:proofErr w:type="spellStart"/>
       <w:r>
         <w:rPr>
           <w:lang w:val="en-US"/>
         </w:rPr>
-        <w:t>tcp</w:t>
       </w:r>
       <w:proofErr w:type="spellEnd"/>
       <w:r>
         <w:rPr>
           <w:lang w:val="en-US"/>
         </w:rPr>
-        <w:t>, 110/</w:t>
       </w:r>
       <w:proofErr w:type="spellStart"/>
       <w:r>
         <w:rPr>
           <w:lang w:val="en-US"/>
         </w:rPr>
-        <w:t>tcp</w:t>
       </w:r>
       <w:proofErr w:type="spellEnd"/>
       <w:r>
         <w:rPr>
           <w:lang w:val="en-US"/>
         </w:rPr>
-        <w:t>, 143/</w:t>
       </w:r>
       <w:proofErr w:type="spellStart"/>
       <w:r>
         <w:rPr>
           <w:lang w:val="en-US"/>
         </w:rPr>
-        <w:t>tcp</w:t>
       </w:r>
       <w:proofErr w:type="spellEnd"/>
       <w:r>
         <w:rPr>
           <w:lang w:val="en-US"/>
         </w:rPr>
-        <w:t>, 21/</w:t>
       </w:r>
       <w:proofErr w:type="spellStart"/>
       <w:r>
         <w:rPr>
           <w:lang w:val="en-US"/>
         </w:rPr>
-        <w:t>tcp</w:t>
       </w:r>
       <w:proofErr w:type="spellEnd"/>
       <w:r>
         <w:rPr>
           <w:lang w:val="en-US"/>
         </w:rPr>
-        <w:t>, 2078/</w:t>
       </w:r>
       <w:proofErr w:type="spellStart"/>
       <w:r>
         <w:rPr>
           <w:lang w:val="en-US"/>
         </w:rPr>
-        <w:t>tcp</w:t>
       </w:r>
       <w:proofErr w:type="spellEnd"/>
       <w:r>
         <w:rPr>
           <w:lang w:val="en-US"/>
         </w:rPr>
-        <w:t>, 2083/</w:t>
       </w:r>
       <w:proofErr w:type="spellStart"/>
       <w:r>
         <w:rPr>
           <w:lang w:val="en-US"/>
         </w:rPr>
-        <w:t>tcp</w:t>
       </w:r>
       <w:proofErr w:type="spellEnd"/>
       <w:r>
         <w:rPr>
           <w:lang w:val="en-US"/>
         </w:rPr>
-        <w:t>, 2096/</w:t>
       </w:r>
       <w:proofErr w:type="spellStart"/>
       <w:r>
         <w:rPr>
           <w:lang w:val="en-US"/>
         </w:rPr>
-        <w:t>tcp</w:t>
       </w:r>
       <w:proofErr w:type="spellEnd"/>
       <w:r>
         <w:rPr>
           <w:lang w:val="en-US"/>
         </w:rPr>
-        <w:t>, general/</w:t>
       </w:r>
       <w:proofErr w:type="spellStart"/>
       <w:r>
         <w:rPr>
           <w:lang w:val="en-US"/>
         </w:rPr>
-        <w:t>tcp</w:t>
       </w:r>
       <w:proofErr w:type="spellEnd"/>
       <w:r>
         <w:rPr>
           <w:lang w:val="en-US"/>
         </w:rPr>
-        <w:t xml:space="preserve"> y general/</w:t>
       </w:r>
       <w:proofErr w:type="spellStart"/>
       <w:r>
         <w:rPr>
           <w:lang w:val="en-US"/>
         </w:rPr>
-        <w:t>icmp</w:t>
       </w:r>
       <w:proofErr w:type="spellEnd"/>
       <w:r>
         <w:rPr>
           <w:lang w:val="en-US"/>
         </w:rPr>
-        <w:t xml:space="preserve">. </w:t>
-      </w:r>
-      <w:r>
-        <w:t>Estado: pendiente de remediación.</w:t>
-      </w:r>
+      </w:r>
+      <w:r/>
     </w:p>
     <w:p>
       <w:pPr>
         <w:pStyle w:val="Estilo6"/>
       </w:pPr>
       <w:r>
-        <w:t xml:space="preserve">Activos VPN/sedes públicas: vpnchiclayo, vpnpiura, vpnchimbote, vpnarequipa, vpncajamarca, vpntrujillo y vpnlima. </w:t>
+        <w:t>{{ hallazgo_ips_9 }}</w:t>
       </w:r>
       <w:r>
         <w:rPr>
           <w:lang w:val="en-US"/>
         </w:rPr>
-        <w:t xml:space="preserve">IPs </w:t>
       </w:r>
       <w:proofErr w:type="spellStart"/>
       <w:r>
         <w:rPr>
           <w:lang w:val="en-US"/>
         </w:rPr>
-        <w:t>relacionadas</w:t>
       </w:r>
       <w:proofErr w:type="spellEnd"/>
       <w:r>
         <w:rPr>
           <w:lang w:val="en-US"/>
         </w:rPr>
-        <w:t xml:space="preserve">: 38.56.220.246, 38.56.216.239, 38.255.111.238, 38.255.105.247, 38.224.75.254, 38.56.215.237 y 170.254.233.113. </w:t>
       </w:r>
       <w:proofErr w:type="spellStart"/>
       <w:r>
         <w:rPr>
           <w:lang w:val="en-US"/>
         </w:rPr>
-        <w:t>Severidad</w:t>
       </w:r>
       <w:proofErr w:type="spellEnd"/>
       <w:r>
         <w:rPr>
           <w:lang w:val="en-US"/>
         </w:rPr>
-        <w:t xml:space="preserve">: Media / Baja. </w:t>
       </w:r>
       <w:proofErr w:type="spellStart"/>
       <w:r>
         <w:rPr>
           <w:lang w:val="en-US"/>
         </w:rPr>
-        <w:t>Vulnerabilidades</w:t>
       </w:r>
       <w:proofErr w:type="spellEnd"/>
       <w:r>
         <w:rPr>
           <w:lang w:val="en-US"/>
         </w:rPr>
-        <w:t xml:space="preserve"> </w:t>
       </w:r>
       <w:proofErr w:type="spellStart"/>
       <w:r>
         <w:rPr>
           <w:lang w:val="en-US"/>
         </w:rPr>
-        <w:t>principales</w:t>
       </w:r>
       <w:proofErr w:type="spellEnd"/>
       <w:r>
         <w:rPr>
           <w:lang w:val="en-US"/>
         </w:rPr>
-        <w:t xml:space="preserve">: Weak Key Exchange (KEX), Weak Host Key, Weak Encryption, Weak MAC, Telnet Unencrypted Cleartext Login e ICMP Timestamp Reply Information Disclosure. </w:t>
-      </w:r>
-      <w:r>
-        <w:t xml:space="preserve">Estado: pendiente de </w:t>
-      </w:r>
+      </w:r>
+      <w:r/>
       <w:proofErr w:type="spellStart"/>
-      <w:r>
-        <w:t>hardening</w:t>
-      </w:r>
+      <w:r/>
       <w:proofErr w:type="spellEnd"/>
-      <w:r>
-        <w:t xml:space="preserve"> criptográfico, eliminación de Telnet y validación por sede.</w:t>
-      </w:r>
+      <w:r/>
     </w:p>
     <w:p>
       <w:pPr>
         <w:pStyle w:val="Estilo6"/>
       </w:pPr>
       <w:r>
-        <w:t xml:space="preserve">Activos públicos adicionales observados: 34.56.74.153, 34.61.232.19 y 144.217.189.217. </w:t>
+        <w:t>{{ hallazgo_ips_10 }}</w:t>
       </w:r>
       <w:proofErr w:type="spellStart"/>
       <w:r>
         <w:rPr>
           <w:lang w:val="en-US"/>
         </w:rPr>
-        <w:t>Severidad</w:t>
       </w:r>
       <w:proofErr w:type="spellEnd"/>
       <w:r>
         <w:rPr>
           <w:lang w:val="en-US"/>
         </w:rPr>
-        <w:t xml:space="preserve">: Baja. </w:t>
       </w:r>
       <w:proofErr w:type="spellStart"/>
       <w:r>
         <w:rPr>
           <w:lang w:val="en-US"/>
         </w:rPr>
-        <w:t>Vulnerabilidades</w:t>
       </w:r>
       <w:proofErr w:type="spellEnd"/>
       <w:r>
         <w:rPr>
           <w:lang w:val="en-US"/>
         </w:rPr>
-        <w:t xml:space="preserve"> </w:t>
       </w:r>
       <w:proofErr w:type="spellStart"/>
       <w:r>
         <w:rPr>
           <w:lang w:val="en-US"/>
         </w:rPr>
-        <w:t>principales</w:t>
       </w:r>
       <w:proofErr w:type="spellEnd"/>
       <w:r>
         <w:rPr>
           <w:lang w:val="en-US"/>
         </w:rPr>
-        <w:t xml:space="preserve">: Weak MAC Algorithm(s) Supported (SSH), TCP Timestamps Information Disclosure e ICMP Timestamp Reply Information Disclosure. </w:t>
-      </w:r>
-      <w:r>
-        <w:t>Estado: pendiente de endurecimiento SSH y validación de exposición.</w:t>
-      </w:r>
+      </w:r>
+      <w:r/>
     </w:p>
     <w:p>
       <w:pPr>
         <w:pStyle w:val="Estilo3"/>
       </w:pPr>
       <w:r>
-        <w:t>Vista complementaria IPS_PUBLICAS_MI-FIBRA</w:t>
+        <w:t>{{ hallazgo_ips_11 }}</w:t>
       </w:r>
     </w:p>
     <w:p>
@@ -2905,19 +2823,16 @@
         <w:pStyle w:val="Estilo3"/>
       </w:pPr>
       <w:r>
-        <w:t xml:space="preserve">La vista complementaria de activos IPS_PUBLICAS_MI-FIBRA evidencia servicios HTTPS/Telnet sobre IPs públicas con certificados no confiables o CN no coincidente, </w:t>
-      </w:r>
-      <w:r>
-        <w:lastRenderedPageBreak/>
-        <w:t>Telnet sin cifrado, TLS/SSL Weak Message Authentication Code Cipher Suites y TLS/SSL Server Supports The Use of Static Key Ciphers.</w:t>
-      </w:r>
+        <w:t>{{ hallazgo_ips_12 }}</w:t>
+      </w:r>
+      <w:r/>
     </w:p>
     <w:p>
       <w:pPr>
         <w:pStyle w:val="Estilo3"/>
       </w:pPr>
       <w:r>
-        <w:t>Activos observados en esta vista: 38.56.215.237, 38.56.220.246, 38.56.216.239, 38.224.75.254, 38.255.105.247, 38.255.111.238 y 170.254.233.113. Estado: Pendiente de remediación y reescaneo.</w:t>
+        <w:t>{{ hallazgo_ips_13 }}</w:t>
       </w:r>
     </w:p>
     <w:p>
@@ -2928,7 +2843,7 @@
         <w:rPr>
           <w:i/>
         </w:rPr>
-        <w:t>Nota técnica: esta vista complementaria se reporta como evidencia operativa del dominio 3.2; para el comparativo semanal se conserva la tabla de hallazgos individuales MonVulE a fin de evitar doble conteo por herramienta sobre activos públicos equivalentes.</w:t>
+        <w:t>{{ hallazgo_ips_14 }}</w:t>
       </w:r>
     </w:p>
     <w:p>
@@ -2947,7 +2862,7 @@
         <w:pStyle w:val="Estilo3"/>
       </w:pPr>
       <w:r>
-        <w:t>La evidencia del dominio perimetral y teletrabajo mantiene hallazgos de severidad alta asociados a autenticación remota, postura de clientes, endurecimiento criptográfico y controles contra fuerza bruta. Durante la semana se mantuvo el seguimiento de estos puntos y continúa pendiente la confirmación de ventana y validación de mitigación.</w:t>
+        <w:t>{{ hallazgo_fw_1 }}</w:t>
       </w:r>
     </w:p>
     <w:p>
@@ -2955,7 +2870,7 @@
         <w:pStyle w:val="Estilo3"/>
       </w:pPr>
       <w:r>
-        <w:t>Hallazgo: Teletrabajo sin MFA en perfiles de autenticación de GlobalProtect. Hosts afectados: PA-LIMA y PA-CHICLAYO. Severidad: Alta. Estado: Pendiente de mitigación.</w:t>
+        <w:t>{{ hallazgo_fw_2 }}</w:t>
       </w:r>
     </w:p>
     <w:p>
@@ -2963,7 +2878,7 @@
         <w:pStyle w:val="Estilo3"/>
       </w:pPr>
       <w:r>
-        <w:t>Hallazgo: Postura débil de GlobalProtect en clientes remotos. Hosts afectados: PA-LIMA y PA-CHICLAYO. Severidad: Alta. Estado: Pendiente de mitigación.</w:t>
+        <w:t>{{ hallazgo_fw_3 }}</w:t>
       </w:r>
     </w:p>
     <w:p>
@@ -2971,7 +2886,7 @@
         <w:pStyle w:val="Estilo3"/>
       </w:pPr>
       <w:r>
-        <w:t>Hallazgo: Criptografía débil/legacy en VPNs site-to-site de perímetro. Hosts afectados: PA440 Cajamarca, Chiclayo, Cirion, Lima, Piura, Trujillo y Arequipa. Severidad: Alta. Estado: Pendiente de estandarización.</w:t>
+        <w:t>{{ hallazgo_fw_4 }}</w:t>
       </w:r>
     </w:p>
     <w:p>
@@ -2979,7 +2894,7 @@
         <w:pStyle w:val="Estilo3"/>
       </w:pPr>
       <w:r>
-        <w:t>Hallazgo: Perfiles TLS de GlobalProtect todavía permiten algoritmos legacy. Hosts afectados: PA440 Arequipa, Canadá, Cajamarca, Chiclayo, Cirion, Chimbote y Lima. Severidad: Alta. Estado: Pendiente de endurecimiento.</w:t>
+        <w:t>{{ hallazgo_fw_5 }}</w:t>
       </w:r>
     </w:p>
     <w:p>
@@ -2987,7 +2902,7 @@
         <w:pStyle w:val="Estilo3"/>
       </w:pPr>
       <w:r>
-        <w:t>Hallazgo: Controles de fuerza bruta y acceso remoto pendientes de ajuste. Severidad: Alta. Estado: Pendiente de validación y ventana.</w:t>
+        <w:t>{{ hallazgo_fw_6 }}</w:t>
       </w:r>
     </w:p>
     <w:p>
@@ -3006,7 +2921,7 @@
         <w:pStyle w:val="Estilo3"/>
       </w:pPr>
       <w:r>
-        <w:t>Durante el periodo evaluado se recibieron evidencias del dominio de servidores correspondientes a sedes Trujillo, Lima, Canadá e IPS_GENESYS. Los activos presentan criticidad Very High y High, con foco de riesgo en Apache HTTPD, OpenSSH, Dell iDRAC, VNC, IPMI, FTP, certificados TLS/SSL, servicios de base de datos y configuraciones criptográficas débiles.</w:t>
+        <w:t>{{ servidor_intro }}</w:t>
       </w:r>
     </w:p>
     <w:p>
@@ -3014,23 +2929,19 @@
         <w:pStyle w:val="Estilo3"/>
       </w:pPr>
       <w:r>
-        <w:t xml:space="preserve">Activos procesados: 15 servidores/equipos de infraestructura de cómputo. </w:t>
+        <w:t>{{ servidor_resumen }}</w:t>
       </w:r>
       <w:proofErr w:type="gramStart"/>
-      <w:r>
-        <w:t>Total</w:t>
-      </w:r>
+      <w:r/>
       <w:proofErr w:type="gramEnd"/>
-      <w:r>
-        <w:t xml:space="preserve"> de hallazgos listados por activo: 336. Distribución referencial por CVSS: Crítico 43, Alto 138, Medio 119, Bajo 22, Informativo 14.</w:t>
-      </w:r>
+      <w:r/>
     </w:p>
     <w:p>
       <w:pPr>
         <w:pStyle w:val="Estilo3"/>
       </w:pPr>
       <w:r>
-        <w:t>En los servidores de IPS_GENESYS se evidencia una reducción considerable de vulnerabilidades: inicialmente se reportaban 100 vulnerabilidades y actualmente permanecen 28. Este avance reduce la exposición operativa del entorno, manteniendo como pendiente la validación final mediante reescaneo y cierre de hallazgos residuales.</w:t>
+        <w:t>{{ servidor_genesys }}</w:t>
       </w:r>
     </w:p>
     <w:p>
@@ -3256,7 +3167,7 @@
               <w:rPr>
                 <w:sz w:val="16"/>
               </w:rPr>
-              <w:t>10.209.10.5, 10.209.31.187, 10.209.31.6, 10.209.31.8, 10.209.31.9</w:t>
+              <w:t>{{ serv_activos_trujillo }}</w:t>
             </w:r>
           </w:p>
         </w:tc>
@@ -3270,7 +3181,7 @@
               <w:rPr>
                 <w:sz w:val="16"/>
               </w:rPr>
-              <w:t>106 (Crítico: 15, Alto: 46, Medio: 39, Bajo: 5, Informativo: 1)</w:t>
+              <w:t>{{ serv_hallazgos_trujillo }}</w:t>
             </w:r>
           </w:p>
         </w:tc>
@@ -3284,7 +3195,7 @@
               <w:rPr>
                 <w:sz w:val="16"/>
               </w:rPr>
-              <w:t>Apache HTTPD, OpenSSH, Dell iDRAC, VNC, IPMI y certificados TLS/SSL.</w:t>
+              <w:t>{{ serv_riesgo_trujillo }}</w:t>
             </w:r>
           </w:p>
         </w:tc>
@@ -3317,7 +3228,7 @@
               <w:rPr>
                 <w:sz w:val="16"/>
               </w:rPr>
-              <w:t>172.16.10.240, 172.16.10.243, 172.16.10.242, 172.16.10.241</w:t>
+              <w:t>{{ serv_activos_genesys }}</w:t>
             </w:r>
           </w:p>
         </w:tc>
@@ -3331,7 +3242,7 @@
               <w:rPr>
                 <w:sz w:val="16"/>
               </w:rPr>
-              <w:t>28 (Alto: 3, Medio: 16, Bajo: 3, Informativo: 6)</w:t>
+              <w:t>{{ serv_hallazgos_genesys }}</w:t>
             </w:r>
           </w:p>
         </w:tc>
@@ -3345,7 +3256,7 @@
               <w:rPr>
                 <w:sz w:val="16"/>
               </w:rPr>
-              <w:t>TLS/SSL, certificados, DNS recursivo, SWEET32/BEAST y Database Open Access.</w:t>
+              <w:t>{{ serv_riesgo_genesys }}</w:t>
             </w:r>
           </w:p>
         </w:tc>
@@ -3378,7 +3289,7 @@
               <w:rPr>
                 <w:sz w:val="16"/>
               </w:rPr>
-              <w:t>10.208.232.4</w:t>
+              <w:t>{{ serv_activos_lima }}</w:t>
             </w:r>
           </w:p>
         </w:tc>
@@ -3392,7 +3303,7 @@
               <w:rPr>
                 <w:sz w:val="16"/>
               </w:rPr>
-              <w:t>38 (Crítico: 5, Alto: 21, Medio: 10, Bajo: 1, Informativo: 1)</w:t>
+              <w:t>{{ serv_hallazgos_lima }}</w:t>
             </w:r>
           </w:p>
         </w:tc>
@@ -3406,7 +3317,7 @@
               <w:rPr>
                 <w:sz w:val="16"/>
               </w:rPr>
-              <w:t>Apache HTTPD y OpenSSH con múltiples CVE y configuración de servicios expuestos.</w:t>
+              <w:t>{{ serv_riesgo_lima }}</w:t>
             </w:r>
           </w:p>
         </w:tc>
@@ -3439,7 +3350,7 @@
               <w:rPr>
                 <w:sz w:val="16"/>
               </w:rPr>
-              <w:t>172.16.32.30, 172.16.32.17, 172.16.32.15, 172.16.32.20, 172.16.32.1</w:t>
+              <w:t>{{ serv_activos_canada }}</w:t>
             </w:r>
           </w:p>
         </w:tc>
@@ -3453,7 +3364,7 @@
               <w:rPr>
                 <w:sz w:val="16"/>
               </w:rPr>
-              <w:t>164 (Crítico: 23, Alto: 68, Medio: 54, Bajo: 13, Informativo: 6)</w:t>
+              <w:t>{{ serv_hallazgos_canada }}</w:t>
             </w:r>
           </w:p>
         </w:tc>
@@ -3467,7 +3378,7 @@
               <w:rPr>
                 <w:sz w:val="16"/>
               </w:rPr>
-              <w:t>FTP, SMTP relay, Apache HTTPD, OpenSSH, TLS/SSL y certificados.</w:t>
+              <w:t>{{ serv_riesgo_canada }}</w:t>
             </w:r>
           </w:p>
         </w:tc>
@@ -3481,53 +3392,45 @@
         <w:rPr>
           <w:lang w:val="en-US"/>
         </w:rPr>
-        <w:t xml:space="preserve">Trujillo / 10.209.10.5: </w:t>
+        <w:t>{{ servidor_trujillo_1 }}</w:t>
       </w:r>
       <w:proofErr w:type="spellStart"/>
       <w:r>
         <w:rPr>
           <w:lang w:val="en-US"/>
         </w:rPr>
-        <w:t>criticidad</w:t>
       </w:r>
       <w:proofErr w:type="spellEnd"/>
       <w:r>
         <w:rPr>
           <w:lang w:val="en-US"/>
         </w:rPr>
-        <w:t xml:space="preserve"> Very High, Risk Score 31,884, 63 </w:t>
       </w:r>
       <w:proofErr w:type="spellStart"/>
       <w:r>
         <w:rPr>
           <w:lang w:val="en-US"/>
         </w:rPr>
-        <w:t>hallazgos</w:t>
       </w:r>
       <w:proofErr w:type="spellEnd"/>
       <w:r>
         <w:rPr>
           <w:lang w:val="en-US"/>
         </w:rPr>
-        <w:t xml:space="preserve">. </w:t>
       </w:r>
       <w:proofErr w:type="spellStart"/>
       <w:r>
         <w:rPr>
           <w:lang w:val="en-US"/>
         </w:rPr>
-        <w:t>Principales</w:t>
       </w:r>
       <w:proofErr w:type="spellEnd"/>
       <w:r>
         <w:rPr>
           <w:lang w:val="en-US"/>
         </w:rPr>
-        <w:t xml:space="preserve">: Apache HTTPD, OpenSSH CVE-2024-6387, SSH Weak MAC y HTTP OPTIONS. </w:t>
-      </w:r>
-      <w:r>
-        <w:t>Estado: pendiente de actualización y reescaneo.</w:t>
-      </w:r>
+      </w:r>
+      <w:r/>
     </w:p>
     <w:p>
       <w:pPr>
@@ -3537,62 +3440,48 @@
         <w:rPr>
           <w:lang w:val="en-US"/>
         </w:rPr>
-        <w:t xml:space="preserve">Trujillo / idrac-3VZKC14 / 10.209.31.187: </w:t>
+        <w:t>{{ servidor_trujillo_2 }}</w:t>
       </w:r>
       <w:proofErr w:type="spellStart"/>
       <w:r>
         <w:rPr>
           <w:lang w:val="en-US"/>
         </w:rPr>
-        <w:t>criticidad</w:t>
       </w:r>
       <w:proofErr w:type="spellEnd"/>
       <w:r>
         <w:rPr>
           <w:lang w:val="en-US"/>
         </w:rPr>
-        <w:t xml:space="preserve"> Very High, Risk Score 6,862, 16 </w:t>
       </w:r>
       <w:proofErr w:type="spellStart"/>
       <w:r>
         <w:rPr>
           <w:lang w:val="en-US"/>
         </w:rPr>
-        <w:t>hallazgos</w:t>
       </w:r>
       <w:proofErr w:type="spellEnd"/>
       <w:r>
         <w:rPr>
           <w:lang w:val="en-US"/>
         </w:rPr>
-        <w:t xml:space="preserve">. </w:t>
-      </w:r>
-      <w:r>
-        <w:t xml:space="preserve">Principales: Dell </w:t>
-      </w:r>
+      </w:r>
+      <w:r/>
       <w:proofErr w:type="spellStart"/>
-      <w:r>
-        <w:t>iDRAC</w:t>
-      </w:r>
+      <w:r/>
       <w:proofErr w:type="spellEnd"/>
-      <w:r>
-        <w:t xml:space="preserve">, </w:t>
-      </w:r>
+      <w:r/>
       <w:proofErr w:type="spellStart"/>
-      <w:r>
-        <w:t>OpenSSH</w:t>
-      </w:r>
+      <w:r/>
       <w:proofErr w:type="spellEnd"/>
-      <w:r>
-        <w:t xml:space="preserve"> CVE-2024-6387, IPMI, certificados TLS/SSL y OpenSSH. Estado: pendiente de actualización de firmware y hardening.</w:t>
-      </w:r>
+      <w:r/>
     </w:p>
     <w:p>
       <w:pPr>
         <w:pStyle w:val="Estilo6"/>
       </w:pPr>
       <w:r>
-        <w:t>Trujillo / 10.209.31.6, 10.209.31.8 y 10.209.31.9: criticidad Very High, Risk Score 3,307 por activo, 9 hallazgos por activo. Principales: VNC, IPMI 2.0 RAKP, certificados no confiables y TLS débil. Estado: pendiente de restricción y segmentación de gestión.</w:t>
+        <w:t>{{ servidor_trujillo_3 }}</w:t>
       </w:r>
     </w:p>
     <w:p>
@@ -3600,7 +3489,7 @@
         <w:pStyle w:val="Estilo6"/>
       </w:pPr>
       <w:r>
-        <w:t>IPS_GENESYS / 172.16.10.240, 172.16.10.243, 172.16.10.242 y 172.16.10.241: criticidad Very High, 28 hallazgos actuales. Principales: TLS/SSL, certificados, DNS recursivo, SWEET32/BEAST y Database Open Access. Estado: pendiente de validación final por reescaneo.</w:t>
+        <w:t>{{ servidor_genesys_2 }}</w:t>
       </w:r>
     </w:p>
     <w:p>
@@ -3611,46 +3500,40 @@
         <w:rPr>
           <w:lang w:val="en-US"/>
         </w:rPr>
-        <w:t xml:space="preserve">Lima / 10.208.232.4: </w:t>
+        <w:t>{{ servidor_lima }}</w:t>
       </w:r>
       <w:proofErr w:type="spellStart"/>
       <w:r>
         <w:rPr>
           <w:lang w:val="en-US"/>
         </w:rPr>
-        <w:t>criticidad</w:t>
       </w:r>
       <w:proofErr w:type="spellEnd"/>
       <w:r>
         <w:rPr>
           <w:lang w:val="en-US"/>
         </w:rPr>
-        <w:t xml:space="preserve"> Very High, Risk Score 18,143, 38 </w:t>
       </w:r>
       <w:proofErr w:type="spellStart"/>
       <w:r>
         <w:rPr>
           <w:lang w:val="en-US"/>
         </w:rPr>
-        <w:t>hallazgos</w:t>
       </w:r>
       <w:proofErr w:type="spellEnd"/>
       <w:r>
         <w:rPr>
           <w:lang w:val="en-US"/>
         </w:rPr>
-        <w:t xml:space="preserve">. </w:t>
-      </w:r>
-      <w:r>
-        <w:t>Principales: Apache HTTPD, múltiples CVE críticas/altas y configuraciones de servicios expuestos. Estado: pendiente de actualización y reescaneo.</w:t>
-      </w:r>
+      </w:r>
+      <w:r/>
     </w:p>
     <w:p>
       <w:pPr>
         <w:pStyle w:val="Estilo6"/>
       </w:pPr>
       <w:r>
-        <w:t>Canadá / 172.16.32.17 y 172.16.32.15: criticidad High, Risk Score 34,862 y 32,881. Principales: FTP sin credenciales, FTP anónimo, SMTP relay, TLS RC4, Apache HTTPD y OpenSSH. Estado: pendiente de remediación.</w:t>
+        <w:t>{{ servidor_canada_1 }}</w:t>
       </w:r>
     </w:p>
     <w:p>
@@ -3658,19 +3541,16 @@
         <w:pStyle w:val="Estilo6"/>
       </w:pPr>
       <w:r>
-        <w:t xml:space="preserve">Canadá / 172.16.32.20, 172.16.32.1 y 172.16.32.30: criticidad High. Principales: </w:t>
-      </w:r>
-      <w:r>
-        <w:lastRenderedPageBreak/>
-        <w:t>SSH Weak MAC, certificados no confiables/self-signed y TLS débil. Estado: pendiente de hardening.</w:t>
-      </w:r>
+        <w:t>{{ servidor_canada_2 }}</w:t>
+      </w:r>
+      <w:r/>
     </w:p>
     <w:p>
       <w:pPr>
         <w:pStyle w:val="Estilo6"/>
       </w:pPr>
       <w:r>
-        <w:t>Prioridad técnica 1: actualizar Apache HTTPD y OpenSSH en activos con criticidad Very High/High, especialmente 10.209.10.5, 10.208.232.4, 172.16.32.15 y activos con CVE-2024-6387.</w:t>
+        <w:t>{{ prioridad_1 }}</w:t>
       </w:r>
     </w:p>
     <w:p>
@@ -3678,7 +3558,7 @@
         <w:pStyle w:val="Estilo6"/>
       </w:pPr>
       <w:r>
-        <w:t>Prioridad técnica 2: remediar Dell iDRAC 10.209.31.187 mediante actualización de firmware y revisión de servicios SSH/IPMI, debido a hallazgos Dell iDRAC, OpenSSH, certificados y exposición administrativa.</w:t>
+        <w:t>{{ prioridad_2 }}</w:t>
       </w:r>
     </w:p>
     <w:p>
@@ -3686,7 +3566,7 @@
         <w:pStyle w:val="Estilo6"/>
       </w:pPr>
       <w:r>
-        <w:t>Prioridad técnica 3: restringir y endurecer VNC/IPMI en 10.209.31.6, 10.209.31.8 y 10.209.31.9, validando segmentación de gestión y necesidad operativa de los servicios expuestos.</w:t>
+        <w:t>{{ prioridad_3 }}</w:t>
       </w:r>
     </w:p>
     <w:p>
@@ -3694,7 +3574,7 @@
         <w:pStyle w:val="Estilo6"/>
       </w:pPr>
       <w:r>
-        <w:t>Prioridad técnica 4: corregir certificados TLS/SSL no confiables, self-signed, inválidos o con CN no coincidente, y deshabilitar suites/algoritmos débiles en servicios HTTPS/SSH.</w:t>
+        <w:t>{{ prioridad_4 }}</w:t>
       </w:r>
     </w:p>
     <w:p>
@@ -3702,7 +3582,7 @@
         <w:pStyle w:val="Estilo6"/>
       </w:pPr>
       <w:r>
-        <w:t>Estado: Pendiente de remediación por parte del cliente, validación de compatibilidad y reescaneo posterior para confirmar reducción de exposición.</w:t>
+        <w:t>{{ servidor_estado }}</w:t>
       </w:r>
     </w:p>
     <w:p>
@@ -3721,7 +3601,7 @@
         <w:pStyle w:val="Estilo3"/>
       </w:pPr>
       <w:r>
-        <w:t>Durante el periodo evaluado se mantiene visibilidad operativa sobre métricas de firewalls Palo Alto desde MonNet / MonInfra, incluyendo disponibilidad SNMP, interfaces, bits enviados/recibidos por interfaz, sesiones activas, utilización de tabla de sesiones, CPU de management/data plane, temperatura y uptime. Estas métricas permiten fortalecer la supervisión de rendimiento y continuidad del perímetro.</w:t>
+        <w:t>{{ switches_parrafo_1 }}</w:t>
       </w:r>
     </w:p>
     <w:p>
@@ -3729,7 +3609,7 @@
         <w:pStyle w:val="Estilo3"/>
       </w:pPr>
       <w:r>
-        <w:t>Desde Zabbix se observa estabilidad operativa de los firewalls monitoreados, sin evidencia entregada de degradación crítica de disponibilidad durante el periodo evaluado.</w:t>
+        <w:t>{{ switches_parrafo_2 }}</w:t>
       </w:r>
     </w:p>
     <w:p>
@@ -3737,7 +3617,7 @@
         <w:pStyle w:val="Estilo3"/>
       </w:pPr>
       <w:r>
-        <w:t>Como siguiente mejora de cobertura, sería recomendable coordinar con Mi Fibra la incorporación de equipos de red tipo switches al monitoreo, previa validación de inventario, accesos, comunidades SNMP o credenciales, segmentos autorizados y alcance operativo definido por el cliente.</w:t>
+        <w:t>{{ switches_parrafo_3 }}</w:t>
       </w:r>
     </w:p>
     <w:p>
@@ -3756,7 +3636,7 @@
         <w:pStyle w:val="Estilo3"/>
       </w:pPr>
       <w:r>
-        <w:t>Durante el periodo evaluado no se registraron hallazgos relevantes en este dominio debido a que no se tienen APs integrados al monitoreo. Se mantiene como requerimiento la incorporación de esta capa al servicio para contar con visibilidad operativa y de seguridad sobre infraestructura WiFi.</w:t>
+        <w:t>{{ wifi_texto }}</w:t>
       </w:r>
     </w:p>
     <w:p>
@@ -3775,7 +3655,7 @@
         <w:pStyle w:val="Estilo3"/>
       </w:pPr>
       <w:r>
-        <w:t>Durante el periodo evaluado se mantiene como antecedente la observación del cliente respecto a la actividad de escaneo asociada al servidor OpenVAS 10.208.232.43, la cual generó alertas o impacto percibido sobre una laptop de usuario final. TXDXSECURE aclaró que dicha IP corresponde a la herramienta utilizada dentro del servicio XOC para realizar escaneos de vulnerabilidades sobre dominios, segmentos y pools de IP definidos dentro del alcance del servicio.</w:t>
+        <w:t>{{ desktops_parrafo_1 }}</w:t>
       </w:r>
     </w:p>
     <w:p>
@@ -3783,8 +3663,7 @@
         <w:pStyle w:val="Estilo3"/>
       </w:pPr>
       <w:r>
-        <w:lastRenderedPageBreak/>
-        <w:t>Estado general: TXDXSECURE queda a disposición de Mi Fibra para coordinar una lista de exclusión o definir rangos más precisos de evaluación en este dominio, de forma que los escaneos se enfoquen en activos autorizados y reduzcan el impacto sobre el normal desarrollo de las labores de usuarios finales.</w:t>
+        <w:t>{{ desktops_parrafo_2 }}</w:t>
       </w:r>
     </w:p>
     <w:p>
@@ -3803,7 +3682,7 @@
         <w:pStyle w:val="Estilo3"/>
       </w:pPr>
       <w:r>
-        <w:t>Durante el periodo evaluado no se registraron hallazgos relevantes en este dominio por falta de inventario y clasificación operativa de activos IT/OT. No se cuenta con IPs identificadas ni con una marca o flag que permita distinguir dichos activos dentro de los monitores de vulnerabilidades.</w:t>
+        <w:t>{{ ot_iot_texto }}</w:t>
       </w:r>
     </w:p>
     <w:p>
@@ -3822,7 +3701,7 @@
         <w:pStyle w:val="Estilo6"/>
       </w:pPr>
       <w:r>
-        <w:t>Se implementaron consultas vía Telegram con comandos para revisar usuarios conectados por GlobalProtect y facilitar trazabilidad operativa desde MonEvents.</w:t>
+        <w:t>{{ accion_semana_1 }}</w:t>
       </w:r>
     </w:p>
     <w:p>
@@ -3830,7 +3709,7 @@
         <w:pStyle w:val="Estilo6"/>
       </w:pPr>
       <w:r>
-        <w:t>Se incorporó análisis histórico para identificar a qué usuario pertenecía una IP privada de GlobalProtect en un momento específico, basado en logs disponibles.</w:t>
+        <w:t>{{ accion_semana_2 }}</w:t>
       </w:r>
     </w:p>
     <w:p>
@@ -3838,7 +3717,7 @@
         <w:pStyle w:val="Estilo6"/>
       </w:pPr>
       <w:r>
-        <w:t>Se realizaron acciones de mitigación de vulnerabilidades en el servidor BD Tráfico/Speedtest (172.16.10.243).</w:t>
+        <w:t>{{ accion_semana_3 }}</w:t>
       </w:r>
     </w:p>
     <w:p>
@@ -3846,7 +3725,7 @@
         <w:pStyle w:val="Estilo6"/>
       </w:pPr>
       <w:r>
-        <w:t>Previamente, se realizaron respaldos de los archivos de bases de datos, configuraciones de WampServer, Apache, PHP, claves de registro y parámetros de seguridad TLS/SCHANNEL, asegurando puntos de restauración ante cualquier contingencia.</w:t>
+        <w:t>{{ accion_semana_4 }}</w:t>
       </w:r>
     </w:p>
     <w:p>
@@ -3854,7 +3733,7 @@
         <w:pStyle w:val="Estilo6"/>
       </w:pPr>
       <w:r>
-        <w:t>Vulnerabilidades críticas y altas asociadas a Apache HTTP Server: se implementó una versión corregida, manteniendo la configuración de módulos, Virtual Hosts y la operatividad de la aplicación.</w:t>
+        <w:t>{{ accion_semana_5 }}</w:t>
       </w:r>
     </w:p>
     <w:p>
@@ -3862,7 +3741,7 @@
         <w:pStyle w:val="Estilo6"/>
       </w:pPr>
       <w:r>
-        <w:t>Vulnerabilidades identificadas en PHP: se implementó una versión corregida dentro de la misma rama 8.3, reduciendo el riesgo de incompatibilidad con la aplicación.</w:t>
+        <w:t>{{ accion_semana_6 }}</w:t>
       </w:r>
     </w:p>
     <w:p>
@@ -3870,7 +3749,7 @@
         <w:pStyle w:val="Estilo6"/>
       </w:pPr>
       <w:r>
-        <w:t>HTTP TRACE Method Enabled: se deshabilitó el método TRACE mediante la directiva TraceEnable Off.</w:t>
+        <w:t>{{ accion_semana_7 }}</w:t>
       </w:r>
     </w:p>
     <w:p>
@@ -3878,7 +3757,7 @@
         <w:pStyle w:val="Estilo6"/>
       </w:pPr>
       <w:r>
-        <w:t>TLS 1.0 y TLS 1.1 habilitados: se deshabilitaron ambos protocolos y se dejó TLS 1.2 habilitado explícitamente para cliente y servidor.</w:t>
+        <w:t>{{ accion_semana_8 }}</w:t>
       </w:r>
     </w:p>
     <w:p>
@@ -3886,7 +3765,7 @@
         <w:pStyle w:val="Estilo6"/>
       </w:pPr>
       <w:r>
-        <w:t>SWEET32 y soporte de 3DES: se retiró la suite TLS_RSA_WITH_3DES_EDE_CBC_SHA.</w:t>
+        <w:t>{{ accion_semana_9 }}</w:t>
       </w:r>
     </w:p>
     <w:p>
@@ -3894,7 +3773,7 @@
         <w:pStyle w:val="Estilo6"/>
       </w:pPr>
       <w:r>
-        <w:t>Static Key Ciphers: se retiraron las suites de intercambio de claves RSA estático identificadas.</w:t>
+        <w:t>{{ accion_semana_10 }}</w:t>
       </w:r>
     </w:p>
     <w:p>
@@ -3902,7 +3781,7 @@
         <w:pStyle w:val="Estilo6"/>
       </w:pPr>
       <w:r>
-        <w:t>Weak Message Authentication Code Cipher Suites y BEAST: se retiraron de forma controlada las suites CBC con SHA-1 involucradas, conservando suites modernas y seguras.</w:t>
+        <w:t>{{ accion_semana_11 }}</w:t>
       </w:r>
     </w:p>
     <w:p>
@@ -3910,7 +3789,7 @@
         <w:pStyle w:val="Estilo6"/>
       </w:pPr>
       <w:r>
-        <w:t>Cifrados NULL: se deshabilitaron las suites que no proporcionaban cifrado efectivo.</w:t>
+        <w:t>{{ accion_semana_12 }}</w:t>
       </w:r>
     </w:p>
     <w:p>
@@ -3918,7 +3797,7 @@
         <w:pStyle w:val="Estilo6"/>
       </w:pPr>
       <w:r>
-        <w:t>Falta de algoritmos de cifrado fuertes: se confirmó la disponibilidad de suites seguras basadas en ECDHE_RSA con AES-128-GCM y AES-256-GCM.</w:t>
+        <w:t>{{ accion_semana_13 }}</w:t>
       </w:r>
     </w:p>
     <w:p>
@@ -3926,7 +3805,7 @@
         <w:pStyle w:val="Estilo6"/>
       </w:pPr>
       <w:r>
-        <w:t>Database Open Access: se creó la regla de firewall “Base De Datos In” para controlar el acceso entrante a los servicios de base de datos.</w:t>
+        <w:t>{{ accion_semana_14 }}</w:t>
       </w:r>
     </w:p>
     <w:p>
@@ -3934,8 +3813,7 @@
         <w:pStyle w:val="Estilo6"/>
       </w:pPr>
       <w:r>
-        <w:lastRenderedPageBreak/>
-        <w:t>Finalmente, se validó la operatividad de Apache, PHP, MySQL y la aplicación Friendly, obteniendo respuesta HTTP 200 y manteniendo la continuidad del servicio.</w:t>
+        <w:t>{{ accion_semana_15 }}</w:t>
       </w:r>
     </w:p>
     <w:p>
@@ -3957,7 +3835,7 @@
         <w:rPr>
           <w:b/>
         </w:rPr>
-        <w:t>Seguridad Reforzada</w:t>
+        <w:t>{{ resultado_seguridad_1 }}</w:t>
       </w:r>
     </w:p>
     <w:p>

</xml_diff>

<commit_message>
qas: cliente=tenant_id, conclusiones en template+ALL_FIELDS, prompts mejorados (131 campos, capitalizacion, sin vacios)
</commit_message>
<xml_diff>
--- a/templates/plantilla_reporte.docx
+++ b/templates/plantilla_reporte.docx
@@ -1449,6 +1449,22 @@
         </w:rPr>
         <w:lastRenderedPageBreak/>
         <w:t>Datos generales</w:t>
+      </w:r>
+    </w:p>
+    <w:p>
+      <w:pPr>
+        <w:pStyle w:val="Estilo1"/>
+      </w:pPr>
+      <w:r>
+        <w:t xml:space="preserve">Cliente</w:t>
+      </w:r>
+    </w:p>
+    <w:p>
+      <w:pPr>
+        <w:pStyle w:val="Estilo1"/>
+      </w:pPr>
+      <w:r>
+        <w:t xml:space="preserve">{{ cliente }}</w:t>
       </w:r>
     </w:p>
     <w:p>
@@ -3836,6 +3852,22 @@
           <w:b/>
         </w:rPr>
         <w:t>{{ resultado_seguridad_1 }}</w:t>
+      </w:r>
+    </w:p>
+    <w:p>
+      <w:pPr>
+        <w:pStyle w:val="Estilo3"/>
+      </w:pPr>
+      <w:r>
+        <w:t xml:space="preserve">Conclusiones</w:t>
+      </w:r>
+    </w:p>
+    <w:p>
+      <w:pPr>
+        <w:pStyle w:val="Estilo3"/>
+      </w:pPr>
+      <w:r>
+        <w:t xml:space="preserve">{{ conclusiones }}</w:t>
       </w:r>
     </w:p>
     <w:p>

</xml_diff>